<commit_message>
fixed lmm and nested
</commit_message>
<xml_diff>
--- a/docs/content/analysis_of_variance/analysis_of_variance_activity.docx
+++ b/docs/content/analysis_of_variance/analysis_of_variance_activity.docx
@@ -7500,7 +7500,730 @@
       </w:r>
     </w:p>
     <w:bookmarkEnd w:id="31"/>
-    <w:bookmarkStart w:id="32" w:name="getting-unstuck"/>
+    <w:bookmarkStart w:id="39" w:name="X27d47381498b01c6b8a976456dcf78370bda595"/>
+    <w:p>
+      <w:pPr>
+        <w:pStyle w:val="Heading1"/>
+      </w:pPr>
+      <w:r>
+        <w:t xml:space="preserve">Part 7 · Take-Home Extension — Crayfish Growth Across Lakes</w:t>
+      </w:r>
+    </w:p>
+    <w:p>
+      <w:pPr>
+        <w:pStyle w:val="FirstParagraph"/>
+      </w:pPr>
+      <w:r>
+        <w:rPr>
+          <w:i/>
+          <w:iCs/>
+        </w:rPr>
+        <w:t xml:space="preserve">Due Monday, October 26 — before the Two-Way ANOVA class.</w:t>
+      </w:r>
+    </w:p>
+    <w:p>
+      <w:pPr>
+        <w:pStyle w:val="BodyText"/>
+      </w:pPr>
+      <w:r>
+        <w:t xml:space="preserve">Same workflow as Parts 1–3 — fit, check assumptions, compare groups — new dataset, new question. This time you decide whether the standard ANOVA route or the Kruskal-Wallis route is the right call, and you pick the post-hoc test yourself; nobody walks you through it step by step.</w:t>
+      </w:r>
+    </w:p>
+    <w:bookmarkStart w:id="32" w:name="background"/>
+    <w:p>
+      <w:pPr>
+        <w:pStyle w:val="Heading2"/>
+      </w:pPr>
+      <w:r>
+        <w:t xml:space="preserve">Background</w:t>
+      </w:r>
+    </w:p>
+    <w:p>
+      <w:pPr>
+        <w:pStyle w:val="FirstParagraph"/>
+      </w:pPr>
+      <w:r>
+        <w:t xml:space="preserve">Sargent &amp; Lodge (2014) reared young-of-year rusty crayfish (</w:t>
+      </w:r>
+      <w:r>
+        <w:rPr>
+          <w:i/>
+          <w:iCs/>
+        </w:rPr>
+        <w:t xml:space="preserve">Orconectes rusticus</w:t>
+      </w:r>
+      <w:r>
+        <w:t xml:space="preserve">) in enclosures across three northern Wisconsin lakes. Below are their daily growth rate measurements.</w:t>
+      </w:r>
+    </w:p>
+    <w:p>
+      <w:pPr>
+        <w:pStyle w:val="BodyText"/>
+      </w:pPr>
+      <w:r>
+        <w:rPr>
+          <w:b/>
+          <w:bCs/>
+        </w:rPr>
+        <w:t xml:space="preserve">▶ Run this:</w:t>
+      </w:r>
+    </w:p>
+    <w:p>
+      <w:pPr>
+        <w:pStyle w:val="SourceCode"/>
+      </w:pPr>
+      <w:r>
+        <w:rPr>
+          <w:rStyle w:val="NormalTok"/>
+        </w:rPr>
+        <w:t xml:space="preserve">cray_df </w:t>
+      </w:r>
+      <w:r>
+        <w:rPr>
+          <w:rStyle w:val="OtherTok"/>
+        </w:rPr>
+        <w:t xml:space="preserve">&lt;-</w:t>
+      </w:r>
+      <w:r>
+        <w:rPr>
+          <w:rStyle w:val="NormalTok"/>
+        </w:rPr>
+        <w:t xml:space="preserve"> </w:t>
+      </w:r>
+      <w:r>
+        <w:rPr>
+          <w:rStyle w:val="FunctionTok"/>
+        </w:rPr>
+        <w:t xml:space="preserve">read_csv</w:t>
+      </w:r>
+      <w:r>
+        <w:rPr>
+          <w:rStyle w:val="NormalTok"/>
+        </w:rPr>
+        <w:t xml:space="preserve">(</w:t>
+      </w:r>
+      <w:r>
+        <w:rPr>
+          <w:rStyle w:val="StringTok"/>
+        </w:rPr>
+        <w:t xml:space="preserve">"data/sargent_lodge_crayfish.csv"</w:t>
+      </w:r>
+      <w:r>
+        <w:rPr>
+          <w:rStyle w:val="NormalTok"/>
+        </w:rPr>
+        <w:t xml:space="preserve">)</w:t>
+      </w:r>
+      <w:r>
+        <w:br/>
+      </w:r>
+      <w:r>
+        <w:rPr>
+          <w:rStyle w:val="FunctionTok"/>
+        </w:rPr>
+        <w:t xml:space="preserve">head</w:t>
+      </w:r>
+      <w:r>
+        <w:rPr>
+          <w:rStyle w:val="NormalTok"/>
+        </w:rPr>
+        <w:t xml:space="preserve">(cray_df)</w:t>
+      </w:r>
+    </w:p>
+    <w:bookmarkEnd w:id="32"/>
+    <w:bookmarkStart w:id="33" w:name="your-task"/>
+    <w:p>
+      <w:pPr>
+        <w:pStyle w:val="Heading2"/>
+      </w:pPr>
+      <w:r>
+        <w:t xml:space="preserve">Your Task</w:t>
+      </w:r>
+    </w:p>
+    <w:p>
+      <w:pPr>
+        <w:pStyle w:val="FirstParagraph"/>
+      </w:pPr>
+      <w:r>
+        <w:rPr>
+          <w:b/>
+          <w:bCs/>
+        </w:rPr>
+        <w:t xml:space="preserve">Question:</w:t>
+      </w:r>
+      <w:r>
+        <w:t xml:space="preserve"> </w:t>
+      </w:r>
+      <w:r>
+        <w:t xml:space="preserve">Does crayfish growth rate (</w:t>
+      </w:r>
+      <w:r>
+        <w:rPr>
+          <w:rStyle w:val="VerbatimChar"/>
+        </w:rPr>
+        <w:t xml:space="preserve">growth_per_day</w:t>
+      </w:r>
+      <w:r>
+        <w:t xml:space="preserve">) differ among the three lakes (</w:t>
+      </w:r>
+      <w:r>
+        <w:rPr>
+          <w:rStyle w:val="VerbatimChar"/>
+        </w:rPr>
+        <w:t xml:space="preserve">lake</w:t>
+      </w:r>
+      <w:r>
+        <w:t xml:space="preserve">)?</w:t>
+      </w:r>
+    </w:p>
+    <w:p>
+      <w:pPr>
+        <w:pStyle w:val="BodyText"/>
+      </w:pPr>
+      <w:r>
+        <w:t xml:space="preserve">✏️</w:t>
+      </w:r>
+      <w:r>
+        <w:t xml:space="preserve"> </w:t>
+      </w:r>
+      <w:r>
+        <w:rPr>
+          <w:b/>
+          <w:bCs/>
+        </w:rPr>
+        <w:t xml:space="preserve">Your turn:</w:t>
+      </w:r>
+      <w:r>
+        <w:t xml:space="preserve"> </w:t>
+      </w:r>
+      <w:r>
+        <w:t xml:space="preserve">State your hypotheses. Check the assumptions yourself and decide whether a standard one-way ANOVA is appropriate here, or whether you should reach for Kruskal-Wallis instead. If groups differ, pick and justify a post-hoc test. Justify your choices, run the analysis, interpret it, and report the result properly.</w:t>
+      </w:r>
+    </w:p>
+    <w:p>
+      <w:pPr>
+        <w:pStyle w:val="SourceCode"/>
+      </w:pPr>
+      <w:r>
+        <w:rPr>
+          <w:rStyle w:val="VerbatimChar"/>
+        </w:rPr>
+        <w:t xml:space="preserve">H0 =</w:t>
+      </w:r>
+      <w:r>
+        <w:br/>
+      </w:r>
+      <w:r>
+        <w:rPr>
+          <w:rStyle w:val="VerbatimChar"/>
+        </w:rPr>
+        <w:t xml:space="preserve">________________________________________________________</w:t>
+      </w:r>
+      <w:r>
+        <w:br/>
+      </w:r>
+      <w:r>
+        <w:rPr>
+          <w:rStyle w:val="VerbatimChar"/>
+        </w:rPr>
+        <w:t xml:space="preserve">Ha =</w:t>
+      </w:r>
+      <w:r>
+        <w:br/>
+      </w:r>
+      <w:r>
+        <w:rPr>
+          <w:rStyle w:val="VerbatimChar"/>
+        </w:rPr>
+        <w:t xml:space="preserve">________________________________________________________</w:t>
+      </w:r>
+      <w:r>
+        <w:br/>
+      </w:r>
+      <w:r>
+        <w:rPr>
+          <w:rStyle w:val="VerbatimChar"/>
+        </w:rPr>
+        <w:t xml:space="preserve">Test I will use and why:</w:t>
+      </w:r>
+      <w:r>
+        <w:br/>
+      </w:r>
+      <w:r>
+        <w:rPr>
+          <w:rStyle w:val="VerbatimChar"/>
+        </w:rPr>
+        <w:t xml:space="preserve">________________________________________________________</w:t>
+      </w:r>
+    </w:p>
+    <w:p>
+      <w:pPr>
+        <w:pStyle w:val="SourceCode"/>
+      </w:pPr>
+      <w:r>
+        <w:rPr>
+          <w:rStyle w:val="CommentTok"/>
+        </w:rPr>
+        <w:t xml:space="preserve"># Write your code here:</w:t>
+      </w:r>
+    </w:p>
+    <w:p>
+      <w:pPr>
+        <w:pStyle w:val="SourceCode"/>
+      </w:pPr>
+      <w:r>
+        <w:rPr>
+          <w:rStyle w:val="VerbatimChar"/>
+        </w:rPr>
+        <w:t xml:space="preserve">Interpretation:</w:t>
+      </w:r>
+      <w:r>
+        <w:br/>
+      </w:r>
+      <w:r>
+        <w:rPr>
+          <w:rStyle w:val="VerbatimChar"/>
+        </w:rPr>
+        <w:t xml:space="preserve">________________________________________________________</w:t>
+      </w:r>
+      <w:r>
+        <w:br/>
+      </w:r>
+      <w:r>
+        <w:rPr>
+          <w:rStyle w:val="VerbatimChar"/>
+        </w:rPr>
+        <w:t xml:space="preserve">________________________________________________________</w:t>
+      </w:r>
+    </w:p>
+    <w:bookmarkEnd w:id="33"/>
+    <w:bookmarkStart w:id="38" w:name="final-figure"/>
+    <w:p>
+      <w:pPr>
+        <w:pStyle w:val="Heading2"/>
+      </w:pPr>
+      <w:r>
+        <w:t xml:space="preserve">Final Figure</w:t>
+      </w:r>
+    </w:p>
+    <w:p>
+      <w:pPr>
+        <w:pStyle w:val="FirstParagraph"/>
+      </w:pPr>
+      <w:r>
+        <w:t xml:space="preserve">Produce one publication-quality figure comparing growth rate across lakes, with post-hoc groupings shown (e.g. a compact letter display) — proper axis labels, no default</w:t>
+      </w:r>
+      <w:r>
+        <w:t xml:space="preserve"> </w:t>
+      </w:r>
+      <w:r>
+        <w:rPr>
+          <w:rStyle w:val="VerbatimChar"/>
+        </w:rPr>
+        <w:t xml:space="preserve">ggplot</w:t>
+      </w:r>
+      <w:r>
+        <w:t xml:space="preserve"> </w:t>
+      </w:r>
+      <w:r>
+        <w:t xml:space="preserve">grey background — and export it with</w:t>
+      </w:r>
+      <w:r>
+        <w:t xml:space="preserve"> </w:t>
+      </w:r>
+      <w:r>
+        <w:rPr>
+          <w:rStyle w:val="VerbatimChar"/>
+        </w:rPr>
+        <w:t xml:space="preserve">ggsave()</w:t>
+      </w:r>
+      <w:r>
+        <w:t xml:space="preserve">.</w:t>
+      </w:r>
+    </w:p>
+    <w:p>
+      <w:pPr>
+        <w:pStyle w:val="SourceCode"/>
+      </w:pPr>
+      <w:r>
+        <w:rPr>
+          <w:rStyle w:val="CommentTok"/>
+        </w:rPr>
+        <w:t xml:space="preserve"># Write your code here:</w:t>
+      </w:r>
+    </w:p>
+    <w:tbl>
+      <w:tblPr>
+        <w:tblStyle w:val="Table"/>
+        <w:tblLook w:firstRow="0" w:lastRow="0" w:firstColumn="0" w:lastColumn="0" w:noHBand="0" w:noVBand="0" w:val="0000"/>
+        <w:tblBorders>
+          <w:top w:val="single" w:sz="4" w:space="0" w:color="0758E5"/>
+          <w:left w:val="single" w:sz="24" w:space="0" w:color="0758E5"/>
+          <w:bottom w:val="single" w:sz="4" w:space="0" w:color="0758E5"/>
+          <w:right w:val="single" w:sz="4" w:space="0" w:color="0758E5"/>
+        </w:tblBorders>
+        <w:tblCellMar>
+          <w:left w:w="144" w:type="dxa"/>
+          <w:right w:w="144" w:type="dxa"/>
+        </w:tblCellMar>
+        <w:tblLook w:firstRow="0" w:lastRow="0" w:firstColumn="0" w:lastColumn="0" w:noHBand="0" w:noVBand="0" w:val="0000"/>
+      </w:tblPr>
+      <w:tr>
+        <w:trPr>
+          <w:cantSplit/>
+        </w:trPr>
+        <w:tc>
+          <w:tcPr>
+            <w:shd w:color="auto" w:fill="dae6fb" w:val="clear"/>
+            <w:tcMar>
+              <w:top w:w="92" w:type="dxa"/>
+              <w:bottom w:w="92" w:type="dxa"/>
+            </w:tcMar>
+          </w:tcPr>
+          <w:p>
+            <w:pPr>
+              <w:pStyle w:val="FirstParagraph"/>
+            </w:pPr>
+            <w:pPr>
+              <w:spacing w:before="0" w:after="0"/>
+              <w:textAlignment w:val="center"/>
+            </w:pPr>
+            <w:r>
+              <w:drawing>
+                <wp:inline>
+                  <wp:extent cx="152400" cy="152400"/>
+                  <wp:effectExtent b="0" l="0" r="0" t="0"/>
+                  <wp:docPr descr="" title="" id="34" name="Picture"/>
+                  <a:graphic>
+                    <a:graphicData uri="http://schemas.openxmlformats.org/drawingml/2006/picture">
+                      <pic:pic>
+                        <pic:nvPicPr>
+                          <pic:cNvPr descr="/Applications/Positron.app/Contents/Resources/app/quarto/share/formats/docx/note.png" id="35" name="Picture"/>
+                          <pic:cNvPicPr>
+                            <a:picLocks noChangeArrowheads="1" noChangeAspect="1"/>
+                          </pic:cNvPicPr>
+                        </pic:nvPicPr>
+                        <pic:blipFill>
+                          <a:blip r:embed="rId23"/>
+                          <a:stretch>
+                            <a:fillRect/>
+                          </a:stretch>
+                        </pic:blipFill>
+                        <pic:spPr bwMode="auto">
+                          <a:xfrm>
+                            <a:off x="0" y="0"/>
+                            <a:ext cx="152400" cy="152400"/>
+                          </a:xfrm>
+                          <a:prstGeom prst="rect">
+                            <a:avLst/>
+                          </a:prstGeom>
+                          <a:noFill/>
+                          <a:ln w="9525">
+                            <a:noFill/>
+                            <a:headEnd/>
+                            <a:tailEnd/>
+                          </a:ln>
+                        </pic:spPr>
+                      </pic:pic>
+                    </a:graphicData>
+                  </a:graphic>
+                </wp:inline>
+              </w:drawing>
+            </w:r>
+            <w:r>
+              <w:t xml:space="preserve"> </w:t>
+            </w:r>
+            <w:r>
+              <w:t xml:space="preserve"> </w:t>
+            </w:r>
+            <w:r>
+              <w:t xml:space="preserve">Note</w:t>
+            </w:r>
+          </w:p>
+        </w:tc>
+      </w:tr>
+      <w:tr>
+        <w:trPr>
+          <w:cantSplit/>
+        </w:trPr>
+        <w:tc>
+          <w:tcPr>
+            <w:tcMar>
+              <w:top w:w="108" w:type="dxa"/>
+              <w:bottom w:w="108" w:type="dxa"/>
+            </w:tcMar>
+          </w:tcPr>
+          <w:p>
+            <w:pPr>
+              <w:pStyle w:val="BodyText"/>
+            </w:pPr>
+            <w:pPr>
+              <w:spacing w:before="16"/>
+            </w:pPr>
+            <w:r>
+              <w:rPr>
+                <w:b/>
+                <w:bCs/>
+              </w:rPr>
+              <w:t xml:space="preserve">📤 What to turn in — due Oct 26</w:t>
+            </w:r>
+          </w:p>
+          <w:p>
+            <w:pPr>
+              <w:pStyle w:val="BodyText"/>
+            </w:pPr>
+            <w:r>
+              <w:t xml:space="preserve">Your write-up should include:</w:t>
+            </w:r>
+          </w:p>
+          <w:p>
+            <w:pPr>
+              <w:pStyle w:val="Compact"/>
+              <w:numPr>
+                <w:ilvl w:val="0"/>
+                <w:numId w:val="1008"/>
+              </w:numPr>
+            </w:pPr>
+            <w:r>
+              <w:t xml:space="preserve">The question</w:t>
+            </w:r>
+          </w:p>
+          <w:p>
+            <w:pPr>
+              <w:pStyle w:val="Compact"/>
+              <w:numPr>
+                <w:ilvl w:val="0"/>
+                <w:numId w:val="1009"/>
+              </w:numPr>
+            </w:pPr>
+            <w:r>
+              <w:t xml:space="preserve">Your hypotheses</w:t>
+            </w:r>
+          </w:p>
+          <w:p>
+            <w:pPr>
+              <w:pStyle w:val="Compact"/>
+              <w:numPr>
+                <w:ilvl w:val="0"/>
+                <w:numId w:val="1010"/>
+              </w:numPr>
+            </w:pPr>
+            <w:r>
+              <w:t xml:space="preserve">Which test you used, and your justification for choosing it</w:t>
+            </w:r>
+          </w:p>
+          <w:p>
+            <w:pPr>
+              <w:pStyle w:val="Compact"/>
+              <w:numPr>
+                <w:ilvl w:val="0"/>
+                <w:numId w:val="1011"/>
+              </w:numPr>
+            </w:pPr>
+            <w:r>
+              <w:t xml:space="preserve">The code and its output</w:t>
+            </w:r>
+          </w:p>
+          <w:p>
+            <w:pPr>
+              <w:pStyle w:val="Compact"/>
+              <w:numPr>
+                <w:ilvl w:val="0"/>
+                <w:numId w:val="1012"/>
+              </w:numPr>
+            </w:pPr>
+            <w:r>
+              <w:t xml:space="preserve">Your interpretation of the result</w:t>
+            </w:r>
+          </w:p>
+          <w:p>
+            <w:pPr>
+              <w:pStyle w:val="Compact"/>
+              <w:numPr>
+                <w:ilvl w:val="0"/>
+                <w:numId w:val="1013"/>
+              </w:numPr>
+            </w:pPr>
+            <w:r>
+              <w:t xml:space="preserve">A final figure showing the result</w:t>
+            </w:r>
+          </w:p>
+          <w:p/>
+        </w:tc>
+      </w:tr>
+    </w:tbl>
+    <w:p>
+      <w:pPr>
+        <w:pStyle w:val="FirstParagraph"/>
+      </w:pPr>
+      <w:r>
+        <w:t xml:space="preserve"> </w:t>
+      </w:r>
+    </w:p>
+    <w:tbl>
+      <w:tblPr>
+        <w:tblStyle w:val="Table"/>
+        <w:tblLook w:firstRow="0" w:lastRow="0" w:firstColumn="0" w:lastColumn="0" w:noHBand="0" w:noVBand="0" w:val="0000"/>
+        <w:tblBorders>
+          <w:top w:val="single" w:sz="4" w:space="0" w:color="0758E5"/>
+          <w:left w:val="single" w:sz="24" w:space="0" w:color="0758E5"/>
+          <w:bottom w:val="single" w:sz="4" w:space="0" w:color="0758E5"/>
+          <w:right w:val="single" w:sz="4" w:space="0" w:color="0758E5"/>
+        </w:tblBorders>
+        <w:tblCellMar>
+          <w:left w:w="144" w:type="dxa"/>
+          <w:right w:w="144" w:type="dxa"/>
+        </w:tblCellMar>
+        <w:tblLook w:firstRow="0" w:lastRow="0" w:firstColumn="0" w:lastColumn="0" w:noHBand="0" w:noVBand="0" w:val="0000"/>
+      </w:tblPr>
+      <w:tr>
+        <w:trPr>
+          <w:cantSplit/>
+        </w:trPr>
+        <w:tc>
+          <w:tcPr>
+            <w:shd w:color="auto" w:fill="dae6fb" w:val="clear"/>
+            <w:tcMar>
+              <w:top w:w="92" w:type="dxa"/>
+              <w:bottom w:w="92" w:type="dxa"/>
+            </w:tcMar>
+          </w:tcPr>
+          <w:p>
+            <w:pPr>
+              <w:pStyle w:val="BodyText"/>
+            </w:pPr>
+            <w:pPr>
+              <w:spacing w:before="0" w:after="0"/>
+              <w:textAlignment w:val="center"/>
+            </w:pPr>
+            <w:r>
+              <w:drawing>
+                <wp:inline>
+                  <wp:extent cx="152400" cy="152400"/>
+                  <wp:effectExtent b="0" l="0" r="0" t="0"/>
+                  <wp:docPr descr="" title="" id="36" name="Picture"/>
+                  <a:graphic>
+                    <a:graphicData uri="http://schemas.openxmlformats.org/drawingml/2006/picture">
+                      <pic:pic>
+                        <pic:nvPicPr>
+                          <pic:cNvPr descr="/Applications/Positron.app/Contents/Resources/app/quarto/share/formats/docx/note.png" id="37" name="Picture"/>
+                          <pic:cNvPicPr>
+                            <a:picLocks noChangeArrowheads="1" noChangeAspect="1"/>
+                          </pic:cNvPicPr>
+                        </pic:nvPicPr>
+                        <pic:blipFill>
+                          <a:blip r:embed="rId23"/>
+                          <a:stretch>
+                            <a:fillRect/>
+                          </a:stretch>
+                        </pic:blipFill>
+                        <pic:spPr bwMode="auto">
+                          <a:xfrm>
+                            <a:off x="0" y="0"/>
+                            <a:ext cx="152400" cy="152400"/>
+                          </a:xfrm>
+                          <a:prstGeom prst="rect">
+                            <a:avLst/>
+                          </a:prstGeom>
+                          <a:noFill/>
+                          <a:ln w="9525">
+                            <a:noFill/>
+                            <a:headEnd/>
+                            <a:tailEnd/>
+                          </a:ln>
+                        </pic:spPr>
+                      </pic:pic>
+                    </a:graphicData>
+                  </a:graphic>
+                </wp:inline>
+              </w:drawing>
+            </w:r>
+            <w:r>
+              <w:t xml:space="preserve"> </w:t>
+            </w:r>
+            <w:r>
+              <w:t xml:space="preserve"> </w:t>
+            </w:r>
+            <w:r>
+              <w:t xml:space="preserve">Note</w:t>
+            </w:r>
+          </w:p>
+        </w:tc>
+      </w:tr>
+      <w:tr>
+        <w:trPr>
+          <w:cantSplit/>
+        </w:trPr>
+        <w:tc>
+          <w:tcPr>
+            <w:tcMar>
+              <w:top w:w="108" w:type="dxa"/>
+              <w:bottom w:w="108" w:type="dxa"/>
+            </w:tcMar>
+          </w:tcPr>
+          <w:p>
+            <w:pPr>
+              <w:pStyle w:val="BodyText"/>
+            </w:pPr>
+            <w:pPr>
+              <w:spacing w:before="16"/>
+            </w:pPr>
+            <w:r>
+              <w:rPr>
+                <w:b/>
+                <w:bCs/>
+              </w:rPr>
+              <w:t xml:space="preserve">Reference</w:t>
+            </w:r>
+          </w:p>
+          <w:p>
+            <w:pPr>
+              <w:pStyle w:val="BodyText"/>
+            </w:pPr>
+            <w:pPr>
+              <w:spacing w:after="16"/>
+            </w:pPr>
+            <w:r>
+              <w:t xml:space="preserve">Sargent, L.W. &amp; Lodge, D.M. (2014). Evolution of invasive traits in nonindigenous species: increased survival and faster growth in invasive populations of rusty crayfish (</w:t>
+            </w:r>
+            <w:r>
+              <w:rPr>
+                <w:i/>
+                <w:iCs/>
+              </w:rPr>
+              <w:t xml:space="preserve">Orconectes rusticus</w:t>
+            </w:r>
+            <w:r>
+              <w:t xml:space="preserve">).</w:t>
+            </w:r>
+            <w:r>
+              <w:t xml:space="preserve"> </w:t>
+            </w:r>
+            <w:r>
+              <w:rPr>
+                <w:i/>
+                <w:iCs/>
+              </w:rPr>
+              <w:t xml:space="preserve">Evolutionary Applications</w:t>
+            </w:r>
+            <w:r>
+              <w:t xml:space="preserve">, 7, 949–961.</w:t>
+            </w:r>
+          </w:p>
+          <w:p/>
+        </w:tc>
+      </w:tr>
+    </w:tbl>
+    <w:p>
+      <w:r>
+        <w:pict>
+          <v:rect style="width:0;height:1.5pt" o:hralign="center" o:hrstd="t" o:hr="t"/>
+        </w:pict>
+      </w:r>
+    </w:p>
+    <w:bookmarkEnd w:id="38"/>
+    <w:bookmarkEnd w:id="39"/>
+    <w:bookmarkStart w:id="40" w:name="getting-unstuck"/>
     <w:p>
       <w:pPr>
         <w:pStyle w:val="Heading1"/>
@@ -7522,7 +8245,7 @@
         <w:pStyle w:val="Compact"/>
         <w:numPr>
           <w:ilvl w:val="0"/>
-          <w:numId w:val="1008"/>
+          <w:numId w:val="1014"/>
         </w:numPr>
       </w:pPr>
       <w:r>
@@ -7544,7 +8267,7 @@
         <w:pStyle w:val="Compact"/>
         <w:numPr>
           <w:ilvl w:val="0"/>
-          <w:numId w:val="1008"/>
+          <w:numId w:val="1014"/>
         </w:numPr>
       </w:pPr>
       <w:r>
@@ -7672,7 +8395,7 @@
         <w:pStyle w:val="Compact"/>
         <w:numPr>
           <w:ilvl w:val="0"/>
-          <w:numId w:val="1008"/>
+          <w:numId w:val="1014"/>
         </w:numPr>
       </w:pPr>
       <w:r>
@@ -7693,7 +8416,7 @@
         <w:pStyle w:val="Compact"/>
         <w:numPr>
           <w:ilvl w:val="0"/>
-          <w:numId w:val="1008"/>
+          <w:numId w:val="1014"/>
         </w:numPr>
       </w:pPr>
       <w:r>
@@ -7741,7 +8464,7 @@
         </w:pict>
       </w:r>
     </w:p>
-    <w:bookmarkEnd w:id="32"/>
+    <w:bookmarkEnd w:id="40"/>
     <w:sectPr>
       <w:pgSz w:h="15840" w:w="12240"/>
       <w:pgMar w:bottom="1440" w:footer="720" w:gutter="0" w:header="720" w:left="1440" w:right="1440" w:top="1440"/>
@@ -8066,6 +8789,24 @@
     </w:lvlOverride>
   </w:num>
   <w:num w:numId="1008">
+    <w:abstractNumId w:val="992"/>
+  </w:num>
+  <w:num w:numId="1009">
+    <w:abstractNumId w:val="992"/>
+  </w:num>
+  <w:num w:numId="1010">
+    <w:abstractNumId w:val="992"/>
+  </w:num>
+  <w:num w:numId="1011">
+    <w:abstractNumId w:val="992"/>
+  </w:num>
+  <w:num w:numId="1012">
+    <w:abstractNumId w:val="992"/>
+  </w:num>
+  <w:num w:numId="1013">
+    <w:abstractNumId w:val="992"/>
+  </w:num>
+  <w:num w:numId="1014">
     <w:abstractNumId w:val="99411"/>
     <w:lvlOverride w:ilvl="0">
       <w:startOverride w:val="1"/>

</xml_diff>